<commit_message>
agrego mis tareas al archivo punto 8
</commit_message>
<xml_diff>
--- a/PUNTO 8.docx
+++ b/PUNTO 8.docx
@@ -130,16 +130,11 @@
         </w:numPr>
       </w:pPr>
       <w:r>
-        <w:t xml:space="preserve">DESIGN SYSTEM O ENLACE </w:t>
-      </w:r>
-      <w:proofErr w:type="gramStart"/>
-      <w:r>
-        <w:t>DEL MI</w:t>
+        <w:t>DESIGN SYSTEM O ENLACE DEL MI</w:t>
       </w:r>
       <w:r>
         <w:t>SMO</w:t>
       </w:r>
-      <w:proofErr w:type="gramEnd"/>
     </w:p>
     <w:p>
       <w:pPr>
@@ -229,18 +224,10 @@
         <w:t>a</w:t>
       </w:r>
       <w:r>
-        <w:t xml:space="preserve">r los primeros </w:t>
-      </w:r>
-      <w:proofErr w:type="gramStart"/>
-      <w:r>
-        <w:t xml:space="preserve">pasos </w:t>
-      </w:r>
-      <w:r>
-        <w:t xml:space="preserve"> implementación</w:t>
-      </w:r>
-      <w:proofErr w:type="gramEnd"/>
-      <w:r>
-        <w:t xml:space="preserve"> de la estructura lógica y la configuración inicial de la aplicación en Android Studio utilizando </w:t>
+        <w:t xml:space="preserve">r los primeros pasos </w:t>
+      </w:r>
+      <w:r>
+        <w:t xml:space="preserve"> implementación de la estructura lógica y la configuración inicial de la aplicación en Android Studio utilizando </w:t>
       </w:r>
       <w:proofErr w:type="spellStart"/>
       <w:r>
@@ -832,10 +819,252 @@
         <w:t> </w:t>
       </w:r>
     </w:p>
-    <w:p>
-      <w:pPr>
-        <w:pStyle w:val="Prrafodelista"/>
-      </w:pPr>
+    <w:p/>
+    <w:p>
+      <w:r>
+        <w:t>Julia Scodelari</w:t>
+      </w:r>
+    </w:p>
+    <w:p>
+      <w:r>
+        <w:t xml:space="preserve">Por mi parte, me encargue, en principio de diseñar la paleta de colores que utilizamos en la aplicación, ensaye diferentes opciones hasta dar con una que </w:t>
+      </w:r>
+      <w:r>
+        <w:lastRenderedPageBreak/>
+        <w:t>fuera colorida</w:t>
+      </w:r>
+      <w:r>
+        <w:t xml:space="preserve">, poseyera buenos contrastes entre colores y cuyas paletas alternativas fueran también coloridas y atractivas. </w:t>
+      </w:r>
+    </w:p>
+    <w:p>
+      <w:r>
+        <w:t xml:space="preserve">Luego, </w:t>
+      </w:r>
+      <w:r>
+        <w:t>mis principales contribuciones en el desarrollo de la aplicación incluyeron:</w:t>
+      </w:r>
+    </w:p>
+    <w:p>
+      <w:pPr>
+        <w:pStyle w:val="Prrafodelista"/>
+        <w:numPr>
+          <w:ilvl w:val="0"/>
+          <w:numId w:val="11"/>
+        </w:numPr>
+      </w:pPr>
+      <w:r>
+        <w:t>La creación de estilos reutilizables para poder aplicar fácilmente la paleta de colores elegida y los estilos de los botones en todas las pantallas del proyecto</w:t>
+      </w:r>
+      <w:r>
+        <w:t xml:space="preserve">, en los archivos themes.xml, colors.xml y styles.xml. </w:t>
+      </w:r>
+    </w:p>
+    <w:p>
+      <w:pPr>
+        <w:pStyle w:val="Prrafodelista"/>
+        <w:numPr>
+          <w:ilvl w:val="0"/>
+          <w:numId w:val="11"/>
+        </w:numPr>
+      </w:pPr>
+      <w:r>
+        <w:t xml:space="preserve">La implementación del patrón MVVM fue mi contribución más grande al proyecto, donde tome las pantallas y la lógica </w:t>
+      </w:r>
+      <w:r>
+        <w:t xml:space="preserve">creada por mis compañeros de equipo y refactorice el proyecto </w:t>
+      </w:r>
+      <w:r>
+        <w:t>para desacoplar de forma limpia la interfaz de usuario de la lógica de negocio y el acceso a datos.</w:t>
+      </w:r>
+      <w:r>
+        <w:t xml:space="preserve"> Además, en este paso del desarrollo aproveché para </w:t>
+      </w:r>
+      <w:r>
+        <w:t xml:space="preserve">adaptar los </w:t>
+      </w:r>
+      <w:proofErr w:type="spellStart"/>
+      <w:r>
+        <w:t>ViewModels</w:t>
+      </w:r>
+      <w:proofErr w:type="spellEnd"/>
+      <w:r>
+        <w:t xml:space="preserve"> </w:t>
+      </w:r>
+      <w:r>
+        <w:t xml:space="preserve">para retener y gestionar el estado de las vistas ante cambios de configuración de la pantalla, </w:t>
+      </w:r>
+      <w:r>
+        <w:t>con lo que se evita</w:t>
+      </w:r>
+      <w:r>
+        <w:t xml:space="preserve"> la sobrecarga en las actividades y </w:t>
+      </w:r>
+      <w:r>
+        <w:t>se garantiza</w:t>
+      </w:r>
+      <w:r>
+        <w:t xml:space="preserve"> un flujo de datos unidireccional y robusto.</w:t>
+      </w:r>
+    </w:p>
+    <w:p>
+      <w:pPr>
+        <w:pStyle w:val="Prrafodelista"/>
+        <w:numPr>
+          <w:ilvl w:val="0"/>
+          <w:numId w:val="11"/>
+        </w:numPr>
+      </w:pPr>
+      <w:r>
+        <w:t xml:space="preserve">Implementé la vista </w:t>
+      </w:r>
+      <w:proofErr w:type="spellStart"/>
+      <w:r>
+        <w:t>activity_menu_settings</w:t>
+      </w:r>
+      <w:proofErr w:type="spellEnd"/>
+      <w:r>
+        <w:t xml:space="preserve">. </w:t>
+      </w:r>
+      <w:proofErr w:type="spellStart"/>
+      <w:r>
+        <w:t>xml</w:t>
+      </w:r>
+      <w:proofErr w:type="spellEnd"/>
+      <w:r>
+        <w:t xml:space="preserve"> y su respectiva clase </w:t>
+      </w:r>
+      <w:proofErr w:type="spellStart"/>
+      <w:r>
+        <w:t>kotlin</w:t>
+      </w:r>
+      <w:proofErr w:type="spellEnd"/>
+      <w:r>
+        <w:t xml:space="preserve"> </w:t>
+      </w:r>
+      <w:proofErr w:type="spellStart"/>
+      <w:r>
+        <w:t>menuSettings</w:t>
+      </w:r>
+      <w:proofErr w:type="spellEnd"/>
+      <w:r>
+        <w:t xml:space="preserve">, lo que permite seleccionar las diferentes paletas de colores disponibles y activar y desactivar los sonidos los efectos de sonido. </w:t>
+      </w:r>
+    </w:p>
+    <w:p>
+      <w:pPr>
+        <w:pStyle w:val="Prrafodelista"/>
+        <w:numPr>
+          <w:ilvl w:val="0"/>
+          <w:numId w:val="11"/>
+        </w:numPr>
+      </w:pPr>
+      <w:r>
+        <w:t xml:space="preserve">Me </w:t>
+      </w:r>
+      <w:r>
+        <w:t>encargué</w:t>
+      </w:r>
+      <w:r>
+        <w:t xml:space="preserve"> de la creación e integración de los recursos multimedia, con ayuda de la IA integrada de Android Studio, generé las imágenes</w:t>
+      </w:r>
+      <w:r>
+        <w:t>,</w:t>
+      </w:r>
+      <w:r>
+        <w:t xml:space="preserve"> </w:t>
+      </w:r>
+      <w:r>
+        <w:t xml:space="preserve">animaciones y sonidos </w:t>
+      </w:r>
+      <w:r>
+        <w:t>utilizados y l</w:t>
+      </w:r>
+      <w:r>
+        <w:t xml:space="preserve">uego los integré dentro de las pantallas del juego, utilizando </w:t>
+      </w:r>
+      <w:r>
+        <w:t xml:space="preserve">(para los sonidos) </w:t>
+      </w:r>
+      <w:r>
+        <w:t xml:space="preserve">la clase </w:t>
+      </w:r>
+      <w:proofErr w:type="spellStart"/>
+      <w:r>
+        <w:t>SoundManager.kt</w:t>
+      </w:r>
+      <w:proofErr w:type="spellEnd"/>
+      <w:r>
+        <w:t xml:space="preserve"> que hace uso de </w:t>
+      </w:r>
+      <w:proofErr w:type="spellStart"/>
+      <w:r>
+        <w:t>android.media</w:t>
+      </w:r>
+      <w:proofErr w:type="spellEnd"/>
+      <w:r>
+        <w:t xml:space="preserve">. </w:t>
+      </w:r>
+    </w:p>
+    <w:p>
+      <w:pPr>
+        <w:pStyle w:val="Prrafodelista"/>
+        <w:numPr>
+          <w:ilvl w:val="0"/>
+          <w:numId w:val="11"/>
+        </w:numPr>
+      </w:pPr>
+      <w:r>
+        <w:t xml:space="preserve">Agregué luego la lógica para que los datos del avatar </w:t>
+      </w:r>
+      <w:r>
+        <w:t xml:space="preserve">ingresados por el usuario persistieran en </w:t>
+      </w:r>
+      <w:proofErr w:type="spellStart"/>
+      <w:r>
+        <w:t>SharedPreferences</w:t>
+      </w:r>
+      <w:proofErr w:type="spellEnd"/>
+      <w:r>
+        <w:t xml:space="preserve"> y se pudieran luego recuperar aunque se cierre la app. </w:t>
+      </w:r>
+    </w:p>
+    <w:p>
+      <w:pPr>
+        <w:pStyle w:val="Prrafodelista"/>
+        <w:numPr>
+          <w:ilvl w:val="0"/>
+          <w:numId w:val="11"/>
+        </w:numPr>
+      </w:pPr>
+      <w:r>
+        <w:t xml:space="preserve">Por último integré a la pantalla de resultado final del juego la visualización de un dato curioso elegido al azar de una lista </w:t>
+      </w:r>
+      <w:r>
+        <w:t>en formato JSON de datos basados en los alimentos seleccionables que ofrecemos en nuestro juego</w:t>
+      </w:r>
+      <w:r>
+        <w:t xml:space="preserve">. La clase </w:t>
+      </w:r>
+      <w:proofErr w:type="spellStart"/>
+      <w:r>
+        <w:t>DatoCuriosoRepository.kt</w:t>
+      </w:r>
+      <w:proofErr w:type="spellEnd"/>
+      <w:r>
+        <w:t xml:space="preserve"> recupera la lista completa del archivo </w:t>
+      </w:r>
+      <w:proofErr w:type="spellStart"/>
+      <w:r>
+        <w:t>datos_curiosos.json</w:t>
+      </w:r>
+      <w:proofErr w:type="spellEnd"/>
+      <w:r>
+        <w:t xml:space="preserve"> y luego selecciona uno al azar de alguno de los alimentos que el usuario seleccionó en su partida. El dato curioso se muestra cuando se pierde la partida y la idea es mostrarle al usuario alternativas a los alimentos </w:t>
+      </w:r>
+      <w:r>
+        <w:t xml:space="preserve">manos sanos que eligió o sugerencias de como cocinarlos de forma más saludable. </w:t>
+      </w:r>
     </w:p>
     <w:p>
       <w:pPr>
@@ -1542,6 +1771,119 @@
     </w:lvl>
   </w:abstractNum>
   <w:abstractNum w:abstractNumId="5" w15:restartNumberingAfterBreak="0">
+    <w:nsid w:val="4D3A7828"/>
+    <w:multiLevelType w:val="hybridMultilevel"/>
+    <w:tmpl w:val="56F67340"/>
+    <w:lvl w:ilvl="0" w:tplc="2C0A0003">
+      <w:start w:val="1"/>
+      <w:numFmt w:val="bullet"/>
+      <w:lvlText w:val="o"/>
+      <w:lvlJc w:val="left"/>
+      <w:pPr>
+        <w:ind w:left="360" w:hanging="360"/>
+      </w:pPr>
+      <w:rPr>
+        <w:rFonts w:ascii="Courier New" w:hAnsi="Courier New" w:cs="Courier New" w:hint="default"/>
+      </w:rPr>
+    </w:lvl>
+    <w:lvl w:ilvl="1" w:tplc="2C0A0003" w:tentative="1">
+      <w:start w:val="1"/>
+      <w:numFmt w:val="bullet"/>
+      <w:lvlText w:val="o"/>
+      <w:lvlJc w:val="left"/>
+      <w:pPr>
+        <w:ind w:left="1080" w:hanging="360"/>
+      </w:pPr>
+      <w:rPr>
+        <w:rFonts w:ascii="Courier New" w:hAnsi="Courier New" w:cs="Courier New" w:hint="default"/>
+      </w:rPr>
+    </w:lvl>
+    <w:lvl w:ilvl="2" w:tplc="2C0A0005" w:tentative="1">
+      <w:start w:val="1"/>
+      <w:numFmt w:val="bullet"/>
+      <w:lvlText w:val=""/>
+      <w:lvlJc w:val="left"/>
+      <w:pPr>
+        <w:ind w:left="1800" w:hanging="360"/>
+      </w:pPr>
+      <w:rPr>
+        <w:rFonts w:ascii="Wingdings" w:hAnsi="Wingdings" w:hint="default"/>
+      </w:rPr>
+    </w:lvl>
+    <w:lvl w:ilvl="3" w:tplc="2C0A0001" w:tentative="1">
+      <w:start w:val="1"/>
+      <w:numFmt w:val="bullet"/>
+      <w:lvlText w:val=""/>
+      <w:lvlJc w:val="left"/>
+      <w:pPr>
+        <w:ind w:left="2520" w:hanging="360"/>
+      </w:pPr>
+      <w:rPr>
+        <w:rFonts w:ascii="Symbol" w:hAnsi="Symbol" w:hint="default"/>
+      </w:rPr>
+    </w:lvl>
+    <w:lvl w:ilvl="4" w:tplc="2C0A0003" w:tentative="1">
+      <w:start w:val="1"/>
+      <w:numFmt w:val="bullet"/>
+      <w:lvlText w:val="o"/>
+      <w:lvlJc w:val="left"/>
+      <w:pPr>
+        <w:ind w:left="3240" w:hanging="360"/>
+      </w:pPr>
+      <w:rPr>
+        <w:rFonts w:ascii="Courier New" w:hAnsi="Courier New" w:cs="Courier New" w:hint="default"/>
+      </w:rPr>
+    </w:lvl>
+    <w:lvl w:ilvl="5" w:tplc="2C0A0005" w:tentative="1">
+      <w:start w:val="1"/>
+      <w:numFmt w:val="bullet"/>
+      <w:lvlText w:val=""/>
+      <w:lvlJc w:val="left"/>
+      <w:pPr>
+        <w:ind w:left="3960" w:hanging="360"/>
+      </w:pPr>
+      <w:rPr>
+        <w:rFonts w:ascii="Wingdings" w:hAnsi="Wingdings" w:hint="default"/>
+      </w:rPr>
+    </w:lvl>
+    <w:lvl w:ilvl="6" w:tplc="2C0A0001" w:tentative="1">
+      <w:start w:val="1"/>
+      <w:numFmt w:val="bullet"/>
+      <w:lvlText w:val=""/>
+      <w:lvlJc w:val="left"/>
+      <w:pPr>
+        <w:ind w:left="4680" w:hanging="360"/>
+      </w:pPr>
+      <w:rPr>
+        <w:rFonts w:ascii="Symbol" w:hAnsi="Symbol" w:hint="default"/>
+      </w:rPr>
+    </w:lvl>
+    <w:lvl w:ilvl="7" w:tplc="2C0A0003" w:tentative="1">
+      <w:start w:val="1"/>
+      <w:numFmt w:val="bullet"/>
+      <w:lvlText w:val="o"/>
+      <w:lvlJc w:val="left"/>
+      <w:pPr>
+        <w:ind w:left="5400" w:hanging="360"/>
+      </w:pPr>
+      <w:rPr>
+        <w:rFonts w:ascii="Courier New" w:hAnsi="Courier New" w:cs="Courier New" w:hint="default"/>
+      </w:rPr>
+    </w:lvl>
+    <w:lvl w:ilvl="8" w:tplc="2C0A0005" w:tentative="1">
+      <w:start w:val="1"/>
+      <w:numFmt w:val="bullet"/>
+      <w:lvlText w:val=""/>
+      <w:lvlJc w:val="left"/>
+      <w:pPr>
+        <w:ind w:left="6120" w:hanging="360"/>
+      </w:pPr>
+      <w:rPr>
+        <w:rFonts w:ascii="Wingdings" w:hAnsi="Wingdings" w:hint="default"/>
+      </w:rPr>
+    </w:lvl>
+  </w:abstractNum>
+  <w:abstractNum w:abstractNumId="6" w15:restartNumberingAfterBreak="0">
     <w:nsid w:val="544D6225"/>
     <w:multiLevelType w:val="multilevel"/>
     <w:tmpl w:val="BD3E9ED2"/>
@@ -1658,7 +2000,7 @@
       </w:pPr>
     </w:lvl>
   </w:abstractNum>
-  <w:abstractNum w:abstractNumId="6" w15:restartNumberingAfterBreak="0">
+  <w:abstractNum w:abstractNumId="7" w15:restartNumberingAfterBreak="0">
     <w:nsid w:val="563566DA"/>
     <w:multiLevelType w:val="multilevel"/>
     <w:tmpl w:val="2C288344"/>
@@ -1771,7 +2113,7 @@
       </w:pPr>
     </w:lvl>
   </w:abstractNum>
-  <w:abstractNum w:abstractNumId="7" w15:restartNumberingAfterBreak="0">
+  <w:abstractNum w:abstractNumId="8" w15:restartNumberingAfterBreak="0">
     <w:nsid w:val="58EA4FE3"/>
     <w:multiLevelType w:val="multilevel"/>
     <w:tmpl w:val="11CE5E96"/>
@@ -1920,7 +2262,7 @@
       </w:rPr>
     </w:lvl>
   </w:abstractNum>
-  <w:abstractNum w:abstractNumId="8" w15:restartNumberingAfterBreak="0">
+  <w:abstractNum w:abstractNumId="9" w15:restartNumberingAfterBreak="0">
     <w:nsid w:val="6B7359E1"/>
     <w:multiLevelType w:val="multilevel"/>
     <w:tmpl w:val="CC4050BE"/>
@@ -2033,7 +2375,7 @@
       </w:pPr>
     </w:lvl>
   </w:abstractNum>
-  <w:abstractNum w:abstractNumId="9" w15:restartNumberingAfterBreak="0">
+  <w:abstractNum w:abstractNumId="10" w15:restartNumberingAfterBreak="0">
     <w:nsid w:val="761133CE"/>
     <w:multiLevelType w:val="multilevel"/>
     <w:tmpl w:val="53602096"/>
@@ -2150,13 +2492,13 @@
     <w:abstractNumId w:val="1"/>
   </w:num>
   <w:num w:numId="2" w16cid:durableId="1136096840">
-    <w:abstractNumId w:val="5"/>
+    <w:abstractNumId w:val="6"/>
   </w:num>
   <w:num w:numId="3" w16cid:durableId="166098124">
-    <w:abstractNumId w:val="8"/>
+    <w:abstractNumId w:val="9"/>
   </w:num>
   <w:num w:numId="4" w16cid:durableId="688066135">
-    <w:abstractNumId w:val="9"/>
+    <w:abstractNumId w:val="10"/>
     <w:lvlOverride w:ilvl="0">
       <w:lvl w:ilvl="0">
         <w:numFmt w:val="decimal"/>
@@ -2166,7 +2508,7 @@
     </w:lvlOverride>
   </w:num>
   <w:num w:numId="5" w16cid:durableId="1108306120">
-    <w:abstractNumId w:val="6"/>
+    <w:abstractNumId w:val="7"/>
     <w:lvlOverride w:ilvl="0">
       <w:lvl w:ilvl="0">
         <w:numFmt w:val="decimal"/>
@@ -2202,7 +2544,7 @@
     </w:lvlOverride>
   </w:num>
   <w:num w:numId="9" w16cid:durableId="2048875601">
-    <w:abstractNumId w:val="7"/>
+    <w:abstractNumId w:val="8"/>
     <w:lvlOverride w:ilvl="0">
       <w:lvl w:ilvl="0">
         <w:numFmt w:val="bullet"/>
@@ -2240,6 +2582,9 @@
         </w:rPr>
       </w:lvl>
     </w:lvlOverride>
+  </w:num>
+  <w:num w:numId="11" w16cid:durableId="1774784407">
+    <w:abstractNumId w:val="5"/>
   </w:num>
 </w:numbering>
 </file>
@@ -2776,7 +3121,7 @@
       <w:rFonts w:eastAsiaTheme="majorEastAsia" w:cstheme="majorBidi"/>
       <w:i/>
       <w:iCs/>
-      <w:color w:val="595959" w:themeColor="text1" w:themeTint="A6"/>
+      <w:color w:val="F5F5F5" w:themeColor="text1" w:themeTint="A6"/>
     </w:rPr>
   </w:style>
   <w:style w:type="paragraph" w:styleId="Ttulo7">
@@ -2797,7 +3142,7 @@
     </w:pPr>
     <w:rPr>
       <w:rFonts w:eastAsiaTheme="majorEastAsia" w:cstheme="majorBidi"/>
-      <w:color w:val="595959" w:themeColor="text1" w:themeTint="A6"/>
+      <w:color w:val="F5F5F5" w:themeColor="text1" w:themeTint="A6"/>
     </w:rPr>
   </w:style>
   <w:style w:type="paragraph" w:styleId="Ttulo8">
@@ -2820,7 +3165,7 @@
       <w:rFonts w:eastAsiaTheme="majorEastAsia" w:cstheme="majorBidi"/>
       <w:i/>
       <w:iCs/>
-      <w:color w:val="272727" w:themeColor="text1" w:themeTint="D8"/>
+      <w:color w:val="F2F2F2" w:themeColor="text1" w:themeTint="D8"/>
     </w:rPr>
   </w:style>
   <w:style w:type="paragraph" w:styleId="Ttulo9">
@@ -2841,12 +3186,13 @@
     </w:pPr>
     <w:rPr>
       <w:rFonts w:eastAsiaTheme="majorEastAsia" w:cstheme="majorBidi"/>
-      <w:color w:val="272727" w:themeColor="text1" w:themeTint="D8"/>
+      <w:color w:val="F2F2F2" w:themeColor="text1" w:themeTint="D8"/>
     </w:rPr>
   </w:style>
   <w:style w:type="character" w:default="1" w:styleId="Fuentedeprrafopredeter">
     <w:name w:val="Default Paragraph Font"/>
     <w:uiPriority w:val="1"/>
+    <w:semiHidden/>
     <w:unhideWhenUsed/>
   </w:style>
   <w:style w:type="table" w:default="1" w:styleId="Tablanormal">
@@ -2948,7 +3294,7 @@
       <w:rFonts w:eastAsiaTheme="majorEastAsia" w:cstheme="majorBidi"/>
       <w:i/>
       <w:iCs/>
-      <w:color w:val="595959" w:themeColor="text1" w:themeTint="A6"/>
+      <w:color w:val="F5F5F5" w:themeColor="text1" w:themeTint="A6"/>
     </w:rPr>
   </w:style>
   <w:style w:type="character" w:customStyle="1" w:styleId="Ttulo7Car">
@@ -2960,7 +3306,7 @@
     <w:rsid w:val="00944DF8"/>
     <w:rPr>
       <w:rFonts w:eastAsiaTheme="majorEastAsia" w:cstheme="majorBidi"/>
-      <w:color w:val="595959" w:themeColor="text1" w:themeTint="A6"/>
+      <w:color w:val="F5F5F5" w:themeColor="text1" w:themeTint="A6"/>
     </w:rPr>
   </w:style>
   <w:style w:type="character" w:customStyle="1" w:styleId="Ttulo8Car">
@@ -2974,7 +3320,7 @@
       <w:rFonts w:eastAsiaTheme="majorEastAsia" w:cstheme="majorBidi"/>
       <w:i/>
       <w:iCs/>
-      <w:color w:val="272727" w:themeColor="text1" w:themeTint="D8"/>
+      <w:color w:val="F2F2F2" w:themeColor="text1" w:themeTint="D8"/>
     </w:rPr>
   </w:style>
   <w:style w:type="character" w:customStyle="1" w:styleId="Ttulo9Car">
@@ -2986,7 +3332,7 @@
     <w:rsid w:val="00944DF8"/>
     <w:rPr>
       <w:rFonts w:eastAsiaTheme="majorEastAsia" w:cstheme="majorBidi"/>
-      <w:color w:val="272727" w:themeColor="text1" w:themeTint="D8"/>
+      <w:color w:val="F2F2F2" w:themeColor="text1" w:themeTint="D8"/>
     </w:rPr>
   </w:style>
   <w:style w:type="paragraph" w:styleId="Ttulo">
@@ -3038,7 +3384,7 @@
     </w:pPr>
     <w:rPr>
       <w:rFonts w:eastAsiaTheme="majorEastAsia" w:cstheme="majorBidi"/>
-      <w:color w:val="595959" w:themeColor="text1" w:themeTint="A6"/>
+      <w:color w:val="F5F5F5" w:themeColor="text1" w:themeTint="A6"/>
       <w:spacing w:val="15"/>
       <w:sz w:val="28"/>
       <w:szCs w:val="28"/>
@@ -3052,7 +3398,7 @@
     <w:rsid w:val="00944DF8"/>
     <w:rPr>
       <w:rFonts w:eastAsiaTheme="majorEastAsia" w:cstheme="majorBidi"/>
-      <w:color w:val="595959" w:themeColor="text1" w:themeTint="A6"/>
+      <w:color w:val="F5F5F5" w:themeColor="text1" w:themeTint="A6"/>
       <w:spacing w:val="15"/>
       <w:sz w:val="28"/>
       <w:szCs w:val="28"/>
@@ -3073,7 +3419,7 @@
     <w:rPr>
       <w:i/>
       <w:iCs/>
-      <w:color w:val="404040" w:themeColor="text1" w:themeTint="BF"/>
+      <w:color w:val="F3F3F3" w:themeColor="text1" w:themeTint="BF"/>
     </w:rPr>
   </w:style>
   <w:style w:type="character" w:customStyle="1" w:styleId="CitaCar">
@@ -3085,7 +3431,7 @@
     <w:rPr>
       <w:i/>
       <w:iCs/>
-      <w:color w:val="404040" w:themeColor="text1" w:themeTint="BF"/>
+      <w:color w:val="F3F3F3" w:themeColor="text1" w:themeTint="BF"/>
     </w:rPr>
   </w:style>
   <w:style w:type="paragraph" w:styleId="Prrafodelista">
@@ -3168,10 +3514,10 @@
   <a:themeElements>
     <a:clrScheme name="Office">
       <a:dk1>
-        <a:sysClr val="windowText" lastClr="000000"/>
+        <a:sysClr val="windowText" lastClr="F0F0F0"/>
       </a:dk1>
       <a:lt1>
-        <a:sysClr val="window" lastClr="FFFFFF"/>
+        <a:sysClr val="window" lastClr="000000"/>
       </a:lt1>
       <a:dk2>
         <a:srgbClr val="0E2841"/>

</xml_diff>